<commit_message>
Ficha: tempo de 12-13 horas e ajustes de layout
</commit_message>
<xml_diff>
--- a/Ficha_preenchida_Filipe_Oliveira.docx
+++ b/Ficha_preenchida_Filipe_Oliveira.docx
@@ -2766,7 +2766,7 @@
               <w:rPr>
                 <w:sz w:val="17"/>
               </w:rPr>
-              <w:t>zona cinzenta: nota no meio, tipo=outro (será usada no 🆕 C, se feito)</w:t>
+              <w:t>zona cinzenta: nota no meio, tipo=outro (será usada no Opcional C, se feito)</w:t>
             </w:r>
           </w:p>
         </w:tc>
@@ -7749,6 +7749,9 @@
           </w:tcPr>
           <w:p>
             <w:r>
+              <w:rPr>
+                <w:sz w:val="14"/>
+              </w:rPr>
               <w:t>C1_abono_simples</w:t>
             </w:r>
           </w:p>
@@ -7817,6 +7820,9 @@
           </w:tcPr>
           <w:p>
             <w:r>
+              <w:rPr>
+                <w:sz w:val="14"/>
+              </w:rPr>
               <w:t>C2_ferias_com_venda</w:t>
             </w:r>
           </w:p>
@@ -7885,6 +7891,9 @@
           </w:tcPr>
           <w:p>
             <w:r>
+              <w:rPr>
+                <w:sz w:val="14"/>
+              </w:rPr>
               <w:t>C3_dado_de_saude</w:t>
             </w:r>
           </w:p>
@@ -7953,6 +7962,9 @@
           </w:tcPr>
           <w:p>
             <w:r>
+              <w:rPr>
+                <w:sz w:val="14"/>
+              </w:rPr>
               <w:t>C4_fora_do_escopo</w:t>
             </w:r>
           </w:p>
@@ -8021,6 +8033,9 @@
           </w:tcPr>
           <w:p>
             <w:r>
+              <w:rPr>
+                <w:sz w:val="14"/>
+              </w:rPr>
               <w:t>C5_sem_matricula</w:t>
             </w:r>
           </w:p>
@@ -8089,6 +8104,9 @@
           </w:tcPr>
           <w:p>
             <w:r>
+              <w:rPr>
+                <w:sz w:val="14"/>
+              </w:rPr>
               <w:t>C6_conflito_de_escala</w:t>
             </w:r>
           </w:p>
@@ -8157,6 +8175,9 @@
           </w:tcPr>
           <w:p>
             <w:r>
+              <w:rPr>
+                <w:sz w:val="14"/>
+              </w:rPr>
               <w:t>C7_autoaprovacao</w:t>
             </w:r>
           </w:p>
@@ -8225,6 +8246,9 @@
           </w:tcPr>
           <w:p>
             <w:r>
+              <w:rPr>
+                <w:sz w:val="14"/>
+              </w:rPr>
               <w:t>C8_idempotencia</w:t>
             </w:r>
           </w:p>
@@ -8293,6 +8317,9 @@
           </w:tcPr>
           <w:p>
             <w:r>
+              <w:rPr>
+                <w:sz w:val="14"/>
+              </w:rPr>
               <w:t>C9_divergencia</w:t>
             </w:r>
           </w:p>
@@ -8361,6 +8388,9 @@
           </w:tcPr>
           <w:p>
             <w:r>
+              <w:rPr>
+                <w:sz w:val="14"/>
+              </w:rPr>
               <w:t>C10_zona_cinzenta</w:t>
             </w:r>
           </w:p>
@@ -8374,7 +8404,7 @@
               <w:rPr>
                 <w:sz w:val="15"/>
               </w:rPr>
-              <w:t>receber → proteger_entrada → pausa em triagem_humana (🆕 C ligado; nota 0,50 fica entre 0,4 e 0,8). Sem o 🆕 C: receber → proteger_entrada → extrair → pedir_dados</w:t>
+              <w:t>receber → proteger_entrada → pausa em triagem_humana (Opcional C ligado; nota 0,50 fica entre 0,4 e 0,8). Sem o Opcional C: receber → proteger_entrada → extrair → pedir_dados</w:t>
             </w:r>
           </w:p>
         </w:tc>
@@ -8429,6 +8459,9 @@
           </w:tcPr>
           <w:p>
             <w:r>
+              <w:rPr>
+                <w:sz w:val="14"/>
+              </w:rPr>
               <w:t>C11_diaria_exterior</w:t>
             </w:r>
           </w:p>
@@ -8497,6 +8530,9 @@
           </w:tcPr>
           <w:p>
             <w:r>
+              <w:rPr>
+                <w:sz w:val="14"/>
+              </w:rPr>
               <w:t>C12_inicio_proibido</w:t>
             </w:r>
           </w:p>
@@ -8744,7 +8780,7 @@
         <w:t xml:space="preserve">Resposta: </w:t>
       </w:r>
       <w:r>
-        <w:t>C9 e C10 pediram dados (pedir_dados) e o extrator não inventou datas. O C10 teve nota de escopo 0,50, abaixo do LIMIAR 0,7, e passou como tipo "outro"; com o 🆕 C ligado ele pausa em triagem_humana (nota entre 0,4 e 0,8). No 🆕 A, os 3 votos do C9 foram iguais, sem divergência.</w:t>
+        <w:t>C9 e C10 pediram dados (pedir_dados) e o extrator não inventou datas. O C10 teve nota de escopo 0,50, abaixo do LIMIAR 0,7, e passou como tipo "outro"; com o Opcional C ligado ele pausa em triagem_humana (nota entre 0,4 e 0,8). No Opcional A, os 3 votos do C9 foram iguais, sem divergência.</w:t>
       </w:r>
     </w:p>
     <w:p>
@@ -10246,7 +10282,7 @@
         <w:t xml:space="preserve">Resposta: </w:t>
       </w:r>
       <w:r>
-        <w:t>Cerca de 7 a 8 horas no total (15/10 à noite a 16/10). A mais difícil foi a Etapa 0, pelo ambiente (Python 3.14 incompatível, troca para OpenRouter e Node para o Inspector), seguida da Etapa 9: foi preciso ajustar a extração para o C7 sem guardrail chegar às regras e testar as negações do server.</w:t>
+        <w:t>Cerca de 12 a 13 horas no total, contando o tempo de análise e conferência (de 15/10 à noite a 16/10). A mais difícil foi a Etapa 0, pelo ambiente (Python 3.14 incompatível, troca para OpenRouter e Node para o Inspector), seguida da Etapa 9: foi preciso ajustar a extração para o C7 sem guardrail chegar às regras e testar as negações do server.</w:t>
       </w:r>
     </w:p>
     <w:p>

</xml_diff>